<commit_message>
Minor tweak to the Word file - the image was missing.  Nothing changed in the scheduled post.
</commit_message>
<xml_diff>
--- a/Posts/2025/12(Dec)/UndertheHood/UTH_12(Dec)_2025_CR3BP_Part1.docx
+++ b/Posts/2025/12(Dec)/UndertheHood/UTH_12(Dec)_2025_CR3BP_Part1.docx
@@ -267,8 +267,54 @@
       </w:r>
     </w:p>
     <w:p>
-      <w:r>
-        <w:t>**image**</w:t>
+      <w:pPr>
+        <w:jc w:val="center"/>
+      </w:pPr>
+      <w:r>
+        <w:rPr>
+          <w:noProof/>
+        </w:rPr>
+        <w:drawing>
+          <wp:inline distT="0" distB="0" distL="0" distR="0" wp14:anchorId="6B0DA231" wp14:editId="556289E5">
+            <wp:extent cx="5441287" cy="1455420"/>
+            <wp:effectExtent l="0" t="0" r="7620" b="0"/>
+            <wp:docPr id="1239141563" name="Picture 1"/>
+            <wp:cNvGraphicFramePr>
+              <a:graphicFrameLocks xmlns:a="http://schemas.openxmlformats.org/drawingml/2006/main" noChangeAspect="1"/>
+            </wp:cNvGraphicFramePr>
+            <a:graphic xmlns:a="http://schemas.openxmlformats.org/drawingml/2006/main">
+              <a:graphicData uri="http://schemas.openxmlformats.org/drawingml/2006/picture">
+                <pic:pic xmlns:pic="http://schemas.openxmlformats.org/drawingml/2006/picture">
+                  <pic:nvPicPr>
+                    <pic:cNvPr id="1239141563" name="Picture 1239141563"/>
+                    <pic:cNvPicPr/>
+                  </pic:nvPicPr>
+                  <pic:blipFill>
+                    <a:blip r:embed="rId10" cstate="print">
+                      <a:extLst>
+                        <a:ext uri="{28A0092B-C50C-407E-A947-70E740481C1C}">
+                          <a14:useLocalDpi xmlns:a14="http://schemas.microsoft.com/office/drawing/2010/main" val="0"/>
+                        </a:ext>
+                      </a:extLst>
+                    </a:blip>
+                    <a:stretch>
+                      <a:fillRect/>
+                    </a:stretch>
+                  </pic:blipFill>
+                  <pic:spPr>
+                    <a:xfrm>
+                      <a:off x="0" y="0"/>
+                      <a:ext cx="5452666" cy="1458464"/>
+                    </a:xfrm>
+                    <a:prstGeom prst="rect">
+                      <a:avLst/>
+                    </a:prstGeom>
+                  </pic:spPr>
+                </pic:pic>
+              </a:graphicData>
+            </a:graphic>
+          </wp:inline>
+        </w:drawing>
       </w:r>
     </w:p>
     <w:p>
@@ -488,6 +534,7 @@
     </w:p>
     <w:p>
       <w:r>
+        <w:lastRenderedPageBreak/>
         <w:t>and</w:t>
       </w:r>
     </w:p>
@@ -610,6 +657,414 @@
       <w:proofErr w:type="gramEnd"/>
       <w:r>
         <w:t>2 = 0$. Substituting in these expressions transforms the equations of motion (now written in component form] to:</w:t>
+      </w:r>
+    </w:p>
+    <w:p>
+      <w:proofErr w:type="gramStart"/>
+      <w:r>
+        <w:t>\[</w:t>
+      </w:r>
+      <w:proofErr w:type="gramEnd"/>
+      <w:r>
+        <w:t xml:space="preserve"> {\</w:t>
+      </w:r>
+      <w:proofErr w:type="spellStart"/>
+      <w:r>
+        <w:t>ddot</w:t>
+      </w:r>
+      <w:proofErr w:type="spellEnd"/>
+      <w:r>
+        <w:t xml:space="preserve"> X} = -(1-\</w:t>
+      </w:r>
+      <w:proofErr w:type="gramStart"/>
+      <w:r>
+        <w:t>mu)\</w:t>
+      </w:r>
+      <w:proofErr w:type="gramEnd"/>
+      <w:r>
+        <w:t xml:space="preserve">frac{X+(1-\mu) \cos </w:t>
+      </w:r>
+      <w:proofErr w:type="gramStart"/>
+      <w:r>
+        <w:t>t}{</w:t>
+      </w:r>
+      <w:proofErr w:type="gramEnd"/>
+      <w:r>
+        <w:t>D_1^3} + \mu \</w:t>
+      </w:r>
+      <w:proofErr w:type="gramStart"/>
+      <w:r>
+        <w:t>frac{</w:t>
+      </w:r>
+      <w:proofErr w:type="gramEnd"/>
+      <w:r>
+        <w:t xml:space="preserve">X-\mu \cos </w:t>
+      </w:r>
+      <w:proofErr w:type="gramStart"/>
+      <w:r>
+        <w:t>t}{</w:t>
+      </w:r>
+      <w:proofErr w:type="gramEnd"/>
+      <w:r>
+        <w:t>D_2^3} \</w:t>
+      </w:r>
+      <w:proofErr w:type="gramStart"/>
+      <w:r>
+        <w:t>; ,</w:t>
+      </w:r>
+      <w:proofErr w:type="gramEnd"/>
+      <w:r>
+        <w:t xml:space="preserve"> \]</w:t>
+      </w:r>
+    </w:p>
+    <w:p>
+      <w:proofErr w:type="gramStart"/>
+      <w:r>
+        <w:t>\[</w:t>
+      </w:r>
+      <w:proofErr w:type="gramEnd"/>
+      <w:r>
+        <w:t xml:space="preserve"> {\</w:t>
+      </w:r>
+      <w:proofErr w:type="spellStart"/>
+      <w:r>
+        <w:t>ddot</w:t>
+      </w:r>
+      <w:proofErr w:type="spellEnd"/>
+      <w:r>
+        <w:t xml:space="preserve"> Y} = -(1-\</w:t>
+      </w:r>
+      <w:proofErr w:type="gramStart"/>
+      <w:r>
+        <w:t>mu)\</w:t>
+      </w:r>
+      <w:proofErr w:type="gramEnd"/>
+      <w:r>
+        <w:t xml:space="preserve">frac{Y+(1-\mu) \sin </w:t>
+      </w:r>
+      <w:proofErr w:type="gramStart"/>
+      <w:r>
+        <w:t>t}{</w:t>
+      </w:r>
+      <w:proofErr w:type="gramEnd"/>
+      <w:r>
+        <w:t>D_1^3} + \mu \</w:t>
+      </w:r>
+      <w:proofErr w:type="gramStart"/>
+      <w:r>
+        <w:t>frac{</w:t>
+      </w:r>
+      <w:proofErr w:type="gramEnd"/>
+      <w:r>
+        <w:t xml:space="preserve">Y-\mu \sin </w:t>
+      </w:r>
+      <w:proofErr w:type="gramStart"/>
+      <w:r>
+        <w:t>t}{</w:t>
+      </w:r>
+      <w:proofErr w:type="gramEnd"/>
+      <w:r>
+        <w:t>D_2^3} \</w:t>
+      </w:r>
+      <w:proofErr w:type="gramStart"/>
+      <w:r>
+        <w:t>; ,</w:t>
+      </w:r>
+      <w:proofErr w:type="gramEnd"/>
+      <w:r>
+        <w:t xml:space="preserve"> \]</w:t>
+      </w:r>
+    </w:p>
+    <w:p>
+      <w:r>
+        <w:t>and</w:t>
+      </w:r>
+    </w:p>
+    <w:p>
+      <w:proofErr w:type="gramStart"/>
+      <w:r>
+        <w:t>\[</w:t>
+      </w:r>
+      <w:proofErr w:type="gramEnd"/>
+      <w:r>
+        <w:t xml:space="preserve"> {\</w:t>
+      </w:r>
+      <w:proofErr w:type="spellStart"/>
+      <w:r>
+        <w:t>ddot</w:t>
+      </w:r>
+      <w:proofErr w:type="spellEnd"/>
+      <w:r>
+        <w:t xml:space="preserve"> Z} = -(1-\</w:t>
+      </w:r>
+      <w:proofErr w:type="gramStart"/>
+      <w:r>
+        <w:t>mu)\</w:t>
+      </w:r>
+      <w:proofErr w:type="gramEnd"/>
+      <w:r>
+        <w:t>frac{Z}{D_1^3} + \mu \frac{Z}{D_2^3} \</w:t>
+      </w:r>
+      <w:proofErr w:type="gramStart"/>
+      <w:r>
+        <w:t>; .</w:t>
+      </w:r>
+      <w:proofErr w:type="gramEnd"/>
+      <w:r>
+        <w:t xml:space="preserve"> \]</w:t>
+      </w:r>
+    </w:p>
+    <w:p>
+      <w:r>
+        <w:t>The distances $D_1$ \&amp; $D_2$ between the primary \&amp; secondary and the restricted body, respectively, are given by:</w:t>
+      </w:r>
+    </w:p>
+    <w:p>
+      <w:proofErr w:type="gramStart"/>
+      <w:r>
+        <w:t>\[</w:t>
+      </w:r>
+      <w:proofErr w:type="gramEnd"/>
+      <w:r>
+        <w:t xml:space="preserve"> D_1 = \</w:t>
+      </w:r>
+      <w:proofErr w:type="gramStart"/>
+      <w:r>
+        <w:t>sqrt{ \left[</w:t>
+      </w:r>
+      <w:proofErr w:type="gramEnd"/>
+      <w:r>
+        <w:t xml:space="preserve"> X + \mu \cos t \</w:t>
+      </w:r>
+      <w:proofErr w:type="gramStart"/>
+      <w:r>
+        <w:t>right]^</w:t>
+      </w:r>
+      <w:proofErr w:type="gramEnd"/>
+      <w:r>
+        <w:t>2 + \</w:t>
+      </w:r>
+      <w:proofErr w:type="gramStart"/>
+      <w:r>
+        <w:t>left[</w:t>
+      </w:r>
+      <w:proofErr w:type="gramEnd"/>
+      <w:r>
+        <w:t xml:space="preserve"> Y + \mu \sin t\</w:t>
+      </w:r>
+      <w:proofErr w:type="gramStart"/>
+      <w:r>
+        <w:t>right]^</w:t>
+      </w:r>
+      <w:proofErr w:type="gramEnd"/>
+      <w:r>
+        <w:t>2 + Z^</w:t>
+      </w:r>
+      <w:proofErr w:type="gramStart"/>
+      <w:r>
+        <w:t>2 }</w:t>
+      </w:r>
+      <w:proofErr w:type="gramEnd"/>
+      <w:r>
+        <w:t xml:space="preserve"> \; \]</w:t>
+      </w:r>
+    </w:p>
+    <w:p>
+      <w:r>
+        <w:t>and</w:t>
+      </w:r>
+    </w:p>
+    <w:p>
+      <w:proofErr w:type="gramStart"/>
+      <w:r>
+        <w:t>\[</w:t>
+      </w:r>
+      <w:proofErr w:type="gramEnd"/>
+      <w:r>
+        <w:t xml:space="preserve"> D_2 = \</w:t>
+      </w:r>
+      <w:proofErr w:type="gramStart"/>
+      <w:r>
+        <w:t>sqrt{ \left[</w:t>
+      </w:r>
+      <w:proofErr w:type="gramEnd"/>
+      <w:r>
+        <w:t xml:space="preserve"> X - (1-\mu) \cos t \</w:t>
+      </w:r>
+      <w:proofErr w:type="gramStart"/>
+      <w:r>
+        <w:t>right]^</w:t>
+      </w:r>
+      <w:proofErr w:type="gramEnd"/>
+      <w:r>
+        <w:t>2 + \</w:t>
+      </w:r>
+      <w:proofErr w:type="gramStart"/>
+      <w:r>
+        <w:t>left[</w:t>
+      </w:r>
+      <w:proofErr w:type="gramEnd"/>
+      <w:r>
+        <w:t xml:space="preserve"> Y - (1- \mu) \sin t\</w:t>
+      </w:r>
+      <w:proofErr w:type="gramStart"/>
+      <w:r>
+        <w:t>right]^</w:t>
+      </w:r>
+      <w:proofErr w:type="gramEnd"/>
+      <w:r>
+        <w:t>2 + Z^</w:t>
+      </w:r>
+      <w:proofErr w:type="gramStart"/>
+      <w:r>
+        <w:t>2 }</w:t>
+      </w:r>
+      <w:proofErr w:type="gramEnd"/>
+      <w:r>
+        <w:t xml:space="preserve"> \</w:t>
+      </w:r>
+      <w:proofErr w:type="gramStart"/>
+      <w:r>
+        <w:t>; .</w:t>
+      </w:r>
+      <w:proofErr w:type="gramEnd"/>
+      <w:r>
+        <w:t>\]</w:t>
+      </w:r>
+    </w:p>
+    <w:p>
+      <w:r>
+        <w:t xml:space="preserve">This form clearly shows that the underlying equations are explicitly </w:t>
+      </w:r>
+      <w:proofErr w:type="gramStart"/>
+      <w:r>
+        <w:t>time-dependent</w:t>
+      </w:r>
+      <w:proofErr w:type="gramEnd"/>
+      <w:r>
+        <w:t>. Of course, this makes sense since the motion of the restricted particle does not influence the motion of the primary and secondary. Their orbital motion acts like an external force that drives the system but is not part of the system. This is sometimes referred to as the restricted particle reacting to but not ‘back-reacting’ on the other two.</w:t>
+      </w:r>
+    </w:p>
+    <w:p>
+      <w:r>
+        <w:t xml:space="preserve">Despite this non-autonomous character, the CR3BP can be cast into </w:t>
+      </w:r>
+      <w:proofErr w:type="spellStart"/>
+      <w:proofErr w:type="gramStart"/>
+      <w:r>
+        <w:t>a</w:t>
+      </w:r>
+      <w:proofErr w:type="spellEnd"/>
+      <w:proofErr w:type="gramEnd"/>
+      <w:r>
+        <w:t xml:space="preserve"> autonomous form. The key insight is to note that since the massive bodies move in circular motion about their center-of-mass, their angular rate is constant</w:t>
+      </w:r>
+      <w:r>
+        <w:t xml:space="preserve">.  If we construct a co-rotating frame so that it rotates around ${\hat Z}$ and has it’s x-axis aligned with ${\hat X}$ at $t=0$ then </w:t>
+      </w:r>
+      <w:r>
+        <w:t>$x_1 = -\mu$ and $x_2 = (1-\mu)$, with $y_1=y_2=z_1=z_2=0$</w:t>
+      </w:r>
+      <w:r>
+        <w:t xml:space="preserve"> (with the lower case letters indicating the corresponding components of position measured by an observer moving with this frame)</w:t>
+      </w:r>
+      <w:r>
+        <w:t xml:space="preserve">. </w:t>
+      </w:r>
+      <w:r>
+        <w:t xml:space="preserve">and, so, in a co-rotating frame they will appear fixed. </w:t>
+      </w:r>
+      <w:r>
+        <w:t xml:space="preserve">We can relate the position components in the inertial frame with those in this co-rotating frame using </w:t>
+      </w:r>
+    </w:p>
+    <w:p>
+      <w:proofErr w:type="gramStart"/>
+      <w:r>
+        <w:t>\[</w:t>
+      </w:r>
+      <w:proofErr w:type="gramEnd"/>
+      <w:r>
+        <w:t xml:space="preserve"> </w:t>
+      </w:r>
+      <w:proofErr w:type="spellStart"/>
+      <w:r>
+        <w:t>X_i</w:t>
+      </w:r>
+      <w:proofErr w:type="spellEnd"/>
+      <w:r>
+        <w:t xml:space="preserve"> = </w:t>
+      </w:r>
+      <w:proofErr w:type="spellStart"/>
+      <w:r>
+        <w:t>x_i</w:t>
+      </w:r>
+      <w:proofErr w:type="spellEnd"/>
+      <w:r>
+        <w:t xml:space="preserve"> \cos(t) – </w:t>
+      </w:r>
+      <w:proofErr w:type="spellStart"/>
+      <w:r>
+        <w:t>y_i</w:t>
+      </w:r>
+      <w:proofErr w:type="spellEnd"/>
+      <w:r>
+        <w:t xml:space="preserve"> \sin(t) \</w:t>
+      </w:r>
+      <w:proofErr w:type="gramStart"/>
+      <w:r>
+        <w:t>; ,</w:t>
+      </w:r>
+      <w:proofErr w:type="gramEnd"/>
+      <w:r>
+        <w:t xml:space="preserve"> \]</w:t>
+      </w:r>
+    </w:p>
+    <w:p>
+      <w:proofErr w:type="gramStart"/>
+      <w:r>
+        <w:t>\[</w:t>
+      </w:r>
+      <w:proofErr w:type="gramEnd"/>
+      <w:r>
+        <w:t xml:space="preserve"> </w:t>
+      </w:r>
+      <w:proofErr w:type="spellStart"/>
+      <w:r>
+        <w:t>Y_i</w:t>
+      </w:r>
+      <w:proofErr w:type="spellEnd"/>
+      <w:r>
+        <w:t xml:space="preserve"> = </w:t>
+      </w:r>
+      <w:proofErr w:type="spellStart"/>
+      <w:r>
+        <w:t>x_i</w:t>
+      </w:r>
+      <w:proofErr w:type="spellEnd"/>
+      <w:r>
+        <w:t xml:space="preserve"> \sin(t) + </w:t>
+      </w:r>
+      <w:proofErr w:type="spellStart"/>
+      <w:r>
+        <w:t>y_i</w:t>
+      </w:r>
+      <w:proofErr w:type="spellEnd"/>
+      <w:r>
+        <w:t xml:space="preserve"> \cos(t) \</w:t>
+      </w:r>
+      <w:proofErr w:type="gramStart"/>
+      <w:r>
+        <w:t>; ,</w:t>
+      </w:r>
+      <w:proofErr w:type="gramEnd"/>
+      <w:r>
+        <w:t xml:space="preserve"> \]</w:t>
+      </w:r>
+    </w:p>
+    <w:p>
+      <w:r>
+        <w:t>and</w:t>
       </w:r>
     </w:p>
     <w:p>
@@ -620,7 +1075,144 @@
       </w:r>
       <w:proofErr w:type="gramEnd"/>
       <w:r>
-        <w:t xml:space="preserve"> {\</w:t>
+        <w:t xml:space="preserve"> </w:t>
+      </w:r>
+      <w:proofErr w:type="spellStart"/>
+      <w:r>
+        <w:t>Z_i</w:t>
+      </w:r>
+      <w:proofErr w:type="spellEnd"/>
+      <w:r>
+        <w:t xml:space="preserve"> = </w:t>
+      </w:r>
+      <w:proofErr w:type="spellStart"/>
+      <w:r>
+        <w:t>z_i</w:t>
+      </w:r>
+      <w:proofErr w:type="spellEnd"/>
+      <w:r>
+        <w:t xml:space="preserve"> \</w:t>
+      </w:r>
+      <w:proofErr w:type="gramStart"/>
+      <w:r>
+        <w:t>; .</w:t>
+      </w:r>
+      <w:proofErr w:type="gramEnd"/>
+      <w:r>
+        <w:t xml:space="preserve"> \]</w:t>
+      </w:r>
+    </w:p>
+    <w:p>
+      <w:r>
+        <w:t>The $</w:t>
+      </w:r>
+      <w:proofErr w:type="spellStart"/>
+      <w:r>
+        <w:t>i</w:t>
+      </w:r>
+      <w:proofErr w:type="spellEnd"/>
+      <w:r>
+        <w:t>$ index</w:t>
+      </w:r>
+      <w:r>
+        <w:t xml:space="preserve"> specifie</w:t>
+      </w:r>
+      <w:r>
+        <w:t xml:space="preserve">s the body in question: </w:t>
+      </w:r>
+      <w:r>
+        <w:t xml:space="preserve">restricted </w:t>
+      </w:r>
+      <w:r>
+        <w:t>$</w:t>
+      </w:r>
+      <w:proofErr w:type="spellStart"/>
+      <w:r>
+        <w:t>i</w:t>
+      </w:r>
+      <w:proofErr w:type="spellEnd"/>
+      <w:r>
+        <w:t xml:space="preserve">$ is </w:t>
+      </w:r>
+      <w:r>
+        <w:t xml:space="preserve">blank, primary </w:t>
+      </w:r>
+      <w:r>
+        <w:t>$</w:t>
+      </w:r>
+      <w:proofErr w:type="spellStart"/>
+      <w:r>
+        <w:t>i</w:t>
+      </w:r>
+      <w:proofErr w:type="spellEnd"/>
+      <w:r>
+        <w:t>=1$</w:t>
+      </w:r>
+      <w:r>
+        <w:t xml:space="preserve">, and secondary </w:t>
+      </w:r>
+      <w:r>
+        <w:t>$</w:t>
+      </w:r>
+      <w:proofErr w:type="spellStart"/>
+      <w:r>
+        <w:t>i</w:t>
+      </w:r>
+      <w:proofErr w:type="spellEnd"/>
+      <w:r>
+        <w:t>=2$</w:t>
+      </w:r>
+      <w:r>
+        <w:t xml:space="preserve">. </w:t>
+      </w:r>
+    </w:p>
+    <w:p>
+      <w:r>
+        <w:t xml:space="preserve">We now need to re-express the inertial equations of motion in the co-rotating frame.  We’ll tackle the terms appearing on the left-hand sides first and then </w:t>
+      </w:r>
+      <w:r>
+        <w:t>right-hand sides second.</w:t>
+      </w:r>
+    </w:p>
+    <w:p>
+      <w:r>
+        <w:t xml:space="preserve">The time derivatives of the position components </w:t>
+      </w:r>
+      <w:r>
+        <w:t xml:space="preserve">on the left-hand sides </w:t>
+      </w:r>
+      <w:r>
+        <w:t>are a bit</w:t>
+      </w:r>
+      <w:r>
+        <w:t xml:space="preserve"> </w:t>
+      </w:r>
+      <w:r>
+        <w:t xml:space="preserve">involved since the transformation to the co-rotating frame is time dependent. </w:t>
+      </w:r>
+      <w:r>
+        <w:t xml:space="preserve"> Fortunately, o</w:t>
+      </w:r>
+      <w:r>
+        <w:t>nly the in-plane components are involved, with the left-hand sides becoming:</w:t>
+      </w:r>
+    </w:p>
+    <w:p>
+      <w:proofErr w:type="gramStart"/>
+      <w:r>
+        <w:t>\[</w:t>
+      </w:r>
+      <w:proofErr w:type="gramEnd"/>
+      <w:r>
+        <w:t xml:space="preserve"> </w:t>
+      </w:r>
+      <w:proofErr w:type="spellStart"/>
+      <w:r>
+        <w:t>LHS_x</w:t>
+      </w:r>
+      <w:proofErr w:type="spellEnd"/>
+      <w:r>
+        <w:t xml:space="preserve"> = {\</w:t>
       </w:r>
       <w:proofErr w:type="spellStart"/>
       <w:r>
@@ -628,47 +1220,20 @@
       </w:r>
       <w:proofErr w:type="spellEnd"/>
       <w:r>
-        <w:t xml:space="preserve"> X} = -(1-\</w:t>
-      </w:r>
-      <w:proofErr w:type="gramStart"/>
-      <w:r>
-        <w:t>mu)\</w:t>
-      </w:r>
-      <w:proofErr w:type="gramEnd"/>
-      <w:r>
-        <w:t xml:space="preserve">frac{X+(1-\mu) \cos </w:t>
-      </w:r>
-      <w:proofErr w:type="gramStart"/>
-      <w:r>
-        <w:t>t}{</w:t>
-      </w:r>
-      <w:proofErr w:type="gramEnd"/>
-      <w:r>
-        <w:t>D_1^3} + \mu \</w:t>
-      </w:r>
-      <w:proofErr w:type="gramStart"/>
-      <w:r>
-        <w:t>frac{</w:t>
-      </w:r>
-      <w:proofErr w:type="gramEnd"/>
-      <w:r>
-        <w:t xml:space="preserve">X-\mu \cos </w:t>
-      </w:r>
-      <w:proofErr w:type="gramStart"/>
-      <w:r>
-        <w:t>t}{</w:t>
-      </w:r>
-      <w:proofErr w:type="gramEnd"/>
-      <w:r>
-        <w:t>D_2^3} \</w:t>
-      </w:r>
-      <w:proofErr w:type="gramStart"/>
-      <w:r>
-        <w:t>; ,</w:t>
-      </w:r>
-      <w:proofErr w:type="gramEnd"/>
-      <w:r>
-        <w:t xml:space="preserve"> \]</w:t>
+        <w:t xml:space="preserve"> x} \cos t – 2 {\dot x} \sin t – x \cos t – {\</w:t>
+      </w:r>
+      <w:proofErr w:type="spellStart"/>
+      <w:r>
+        <w:t>ddot</w:t>
+      </w:r>
+      <w:proofErr w:type="spellEnd"/>
+      <w:r>
+        <w:t xml:space="preserve"> y} \sin t – 2 {\dot y} \cos t + y \sin t \; \]</w:t>
+      </w:r>
+    </w:p>
+    <w:p>
+      <w:r>
+        <w:t xml:space="preserve">and </w:t>
       </w:r>
     </w:p>
     <w:p>
@@ -678,7 +1243,15 @@
       </w:r>
       <w:proofErr w:type="gramEnd"/>
       <w:r>
-        <w:t xml:space="preserve"> {\</w:t>
+        <w:t xml:space="preserve"> </w:t>
+      </w:r>
+      <w:proofErr w:type="spellStart"/>
+      <w:r>
+        <w:t>LHS_y</w:t>
+      </w:r>
+      <w:proofErr w:type="spellEnd"/>
+      <w:r>
+        <w:t xml:space="preserve"> = {\</w:t>
       </w:r>
       <w:proofErr w:type="spellStart"/>
       <w:r>
@@ -686,52 +1259,60 @@
       </w:r>
       <w:proofErr w:type="spellEnd"/>
       <w:r>
-        <w:t xml:space="preserve"> Y} = -(1-\</w:t>
-      </w:r>
-      <w:proofErr w:type="gramStart"/>
-      <w:r>
-        <w:t>mu)\</w:t>
-      </w:r>
-      <w:proofErr w:type="gramEnd"/>
-      <w:r>
-        <w:t xml:space="preserve">frac{Y+(1-\mu) \sin </w:t>
-      </w:r>
-      <w:proofErr w:type="gramStart"/>
-      <w:r>
-        <w:t>t}{</w:t>
-      </w:r>
-      <w:proofErr w:type="gramEnd"/>
-      <w:r>
-        <w:t>D_1^3} + \mu \</w:t>
-      </w:r>
-      <w:proofErr w:type="gramStart"/>
-      <w:r>
-        <w:t>frac{</w:t>
-      </w:r>
-      <w:proofErr w:type="gramEnd"/>
-      <w:r>
-        <w:t xml:space="preserve">Y-\mu \sin </w:t>
-      </w:r>
-      <w:proofErr w:type="gramStart"/>
-      <w:r>
-        <w:t>t}{</w:t>
-      </w:r>
-      <w:proofErr w:type="gramEnd"/>
-      <w:r>
-        <w:t>D_2^3} \</w:t>
-      </w:r>
-      <w:proofErr w:type="gramStart"/>
-      <w:r>
-        <w:t>; ,</w:t>
-      </w:r>
-      <w:proofErr w:type="gramEnd"/>
-      <w:r>
-        <w:t xml:space="preserve"> \]</w:t>
-      </w:r>
-    </w:p>
-    <w:p>
-      <w:r>
-        <w:t>and</w:t>
+        <w:t xml:space="preserve"> y} \cos t – 2 {\dot y} \sin t – y \cos t + {\</w:t>
+      </w:r>
+      <w:proofErr w:type="spellStart"/>
+      <w:r>
+        <w:t>ddot</w:t>
+      </w:r>
+      <w:proofErr w:type="spellEnd"/>
+      <w:r>
+        <w:t xml:space="preserve"> x} \sin t – 2 {\dot x} \cos t - x \sin t \</w:t>
+      </w:r>
+      <w:proofErr w:type="gramStart"/>
+      <w:r>
+        <w:t>; .</w:t>
+      </w:r>
+      <w:proofErr w:type="gramEnd"/>
+      <w:r>
+        <w:t>\]</w:t>
+      </w:r>
+    </w:p>
+    <w:p>
+      <w:r>
+        <w:t xml:space="preserve">Note that the terms involving a single time derivative (either </w:t>
+      </w:r>
+      <w:proofErr w:type="gramStart"/>
+      <w:r>
+        <w:t>${\</w:t>
+      </w:r>
+      <w:proofErr w:type="gramEnd"/>
+      <w:r>
+        <w:t xml:space="preserve">dot </w:t>
+      </w:r>
+      <w:proofErr w:type="gramStart"/>
+      <w:r>
+        <w:t>x}$</w:t>
+      </w:r>
+      <w:proofErr w:type="gramEnd"/>
+      <w:r>
+        <w:t xml:space="preserve"> or </w:t>
+      </w:r>
+      <w:proofErr w:type="gramStart"/>
+      <w:r>
+        <w:t>${\</w:t>
+      </w:r>
+      <w:proofErr w:type="gramEnd"/>
+      <w:r>
+        <w:t xml:space="preserve">dot </w:t>
+      </w:r>
+      <w:proofErr w:type="gramStart"/>
+      <w:r>
+        <w:t>y}$</w:t>
+      </w:r>
+      <w:proofErr w:type="gramEnd"/>
+      <w:r>
+        <w:t xml:space="preserve">) appear with opposite signs in the two left-hand sides. This leads to taking linear combinations of the two to isolate the motion for $x$ and $y$, more cleanly: </w:t>
       </w:r>
     </w:p>
     <w:p>
@@ -741,213 +1322,196 @@
       </w:r>
       <w:proofErr w:type="gramEnd"/>
       <w:r>
-        <w:t xml:space="preserve"> {\</w:t>
-      </w:r>
-      <w:proofErr w:type="spellStart"/>
+        <w:t xml:space="preserve"> </w:t>
+      </w:r>
+      <w:proofErr w:type="spellStart"/>
+      <w:r>
+        <w:t>LHS_x</w:t>
+      </w:r>
+      <w:proofErr w:type="spellEnd"/>
+      <w:r>
+        <w:t xml:space="preserve"> \cos t + </w:t>
+      </w:r>
+      <w:proofErr w:type="spellStart"/>
+      <w:r>
+        <w:t>LHS_y</w:t>
+      </w:r>
+      <w:proofErr w:type="spellEnd"/>
+      <w:r>
+        <w:t xml:space="preserve"> \sin t </w:t>
+      </w:r>
+      <w:proofErr w:type="gramStart"/>
+      <w:r>
+        <w:t>= {\</w:t>
+      </w:r>
+      <w:proofErr w:type="spellStart"/>
+      <w:proofErr w:type="gramEnd"/>
       <w:r>
         <w:t>ddot</w:t>
       </w:r>
       <w:proofErr w:type="spellEnd"/>
       <w:r>
-        <w:t xml:space="preserve"> Z} = -(1-\</w:t>
-      </w:r>
-      <w:proofErr w:type="gramStart"/>
-      <w:r>
-        <w:t>mu)\</w:t>
-      </w:r>
-      <w:proofErr w:type="gramEnd"/>
-      <w:r>
-        <w:t>frac{Z}{D_1^3} + \mu \frac{Z}{D_2^3} \</w:t>
-      </w:r>
-      <w:proofErr w:type="gramStart"/>
-      <w:r>
+        <w:t xml:space="preserve"> </w:t>
+      </w:r>
+      <w:proofErr w:type="gramStart"/>
+      <w:r>
+        <w:t>x}</w:t>
+      </w:r>
+      <w:r>
+        <w:t>-</w:t>
+      </w:r>
+      <w:r>
+        <w:t>2 {\</w:t>
+      </w:r>
+      <w:proofErr w:type="gramEnd"/>
+      <w:r>
+        <w:t xml:space="preserve">dot </w:t>
+      </w:r>
+      <w:proofErr w:type="gramStart"/>
+      <w:r>
+        <w:t>y}</w:t>
+      </w:r>
+      <w:r>
+        <w:t>-</w:t>
+      </w:r>
+      <w:proofErr w:type="gramEnd"/>
+      <w:r>
+        <w:t>x \; \]</w:t>
+      </w:r>
+    </w:p>
+    <w:p>
+      <w:r>
+        <w:t xml:space="preserve">and </w:t>
+      </w:r>
+    </w:p>
+    <w:p>
+      <w:proofErr w:type="gramStart"/>
+      <w:r>
+        <w:rPr>
+          <w:lang w:val="es-ES"/>
+        </w:rPr>
+        <w:t>\[</w:t>
+      </w:r>
+      <w:proofErr w:type="gramEnd"/>
+      <w:r>
+        <w:rPr>
+          <w:lang w:val="es-ES"/>
+        </w:rPr>
+        <w:t xml:space="preserve"> </w:t>
+      </w:r>
+      <w:r>
+        <w:rPr>
+          <w:lang w:val="es-ES"/>
+        </w:rPr>
+        <w:t>-</w:t>
+      </w:r>
+      <w:proofErr w:type="spellStart"/>
+      <w:r>
+        <w:rPr>
+          <w:lang w:val="es-ES"/>
+        </w:rPr>
+        <w:t>LHS_x</w:t>
+      </w:r>
+      <w:proofErr w:type="spellEnd"/>
+      <w:r>
+        <w:rPr>
+          <w:lang w:val="es-ES"/>
+        </w:rPr>
+        <w:t xml:space="preserve"> \sin t </w:t>
+      </w:r>
+      <w:r>
+        <w:rPr>
+          <w:lang w:val="es-ES"/>
+        </w:rPr>
+        <w:t>+</w:t>
+      </w:r>
+      <w:r>
+        <w:rPr>
+          <w:lang w:val="es-ES"/>
+        </w:rPr>
+        <w:t xml:space="preserve"> LHS_y \cos t = {\</w:t>
+      </w:r>
+      <w:proofErr w:type="spellStart"/>
+      <w:r>
+        <w:rPr>
+          <w:lang w:val="es-ES"/>
+        </w:rPr>
+        <w:t>ddot</w:t>
+      </w:r>
+      <w:proofErr w:type="spellEnd"/>
+      <w:r>
+        <w:rPr>
+          <w:lang w:val="es-ES"/>
+        </w:rPr>
+        <w:t xml:space="preserve"> y} </w:t>
+      </w:r>
+      <w:r>
+        <w:rPr>
+          <w:lang w:val="es-ES"/>
+        </w:rPr>
+        <w:t>+</w:t>
+      </w:r>
+      <w:r>
+        <w:rPr>
+          <w:lang w:val="es-ES"/>
+        </w:rPr>
+        <w:t xml:space="preserve"> 2{\</w:t>
+      </w:r>
+      <w:proofErr w:type="spellStart"/>
+      <w:r>
+        <w:rPr>
+          <w:lang w:val="es-ES"/>
+        </w:rPr>
+        <w:t>dot</w:t>
+      </w:r>
+      <w:proofErr w:type="spellEnd"/>
+      <w:r>
+        <w:rPr>
+          <w:lang w:val="es-ES"/>
+        </w:rPr>
+        <w:t xml:space="preserve"> x} </w:t>
+      </w:r>
+      <w:r>
+        <w:rPr>
+          <w:lang w:val="es-ES"/>
+        </w:rPr>
+        <w:t>-</w:t>
+      </w:r>
+      <w:r>
+        <w:rPr>
+          <w:lang w:val="es-ES"/>
+        </w:rPr>
+        <w:t xml:space="preserve"> y \</w:t>
+      </w:r>
+      <w:proofErr w:type="gramStart"/>
+      <w:r>
+        <w:rPr>
+          <w:lang w:val="es-ES"/>
+        </w:rPr>
         <w:t>; .</w:t>
       </w:r>
       <w:proofErr w:type="gramEnd"/>
       <w:r>
-        <w:t xml:space="preserve"> \]</w:t>
-      </w:r>
-    </w:p>
-    <w:p>
-      <w:r>
-        <w:t>The distances $D_1$ \&amp; $D_2$ between the primary \&amp; secondary and the restricted body, respectively, are given by:</w:t>
-      </w:r>
-    </w:p>
-    <w:p>
-      <w:proofErr w:type="gramStart"/>
-      <w:r>
-        <w:t>\[</w:t>
-      </w:r>
-      <w:proofErr w:type="gramEnd"/>
-      <w:r>
-        <w:t xml:space="preserve"> D_1 = \</w:t>
-      </w:r>
-      <w:proofErr w:type="gramStart"/>
-      <w:r>
-        <w:t>sqrt{ \left[</w:t>
-      </w:r>
-      <w:proofErr w:type="gramEnd"/>
-      <w:r>
-        <w:t xml:space="preserve"> X + \mu \cos t \</w:t>
-      </w:r>
-      <w:proofErr w:type="gramStart"/>
-      <w:r>
-        <w:t>right]^</w:t>
-      </w:r>
-      <w:proofErr w:type="gramEnd"/>
-      <w:r>
-        <w:t>2 + \</w:t>
-      </w:r>
-      <w:proofErr w:type="gramStart"/>
-      <w:r>
-        <w:t>left[</w:t>
-      </w:r>
-      <w:proofErr w:type="gramEnd"/>
-      <w:r>
-        <w:t xml:space="preserve"> Y + \mu \sin t\</w:t>
-      </w:r>
-      <w:proofErr w:type="gramStart"/>
-      <w:r>
-        <w:t>right]^</w:t>
-      </w:r>
-      <w:proofErr w:type="gramEnd"/>
-      <w:r>
-        <w:t>2 + Z^</w:t>
-      </w:r>
-      <w:proofErr w:type="gramStart"/>
-      <w:r>
-        <w:t>2 }</w:t>
-      </w:r>
-      <w:proofErr w:type="gramEnd"/>
-      <w:r>
-        <w:t xml:space="preserve"> \; \]</w:t>
-      </w:r>
-    </w:p>
-    <w:p>
-      <w:r>
-        <w:t>and</w:t>
-      </w:r>
-    </w:p>
-    <w:p>
-      <w:proofErr w:type="gramStart"/>
-      <w:r>
-        <w:t>\[</w:t>
-      </w:r>
-      <w:proofErr w:type="gramEnd"/>
-      <w:r>
-        <w:t xml:space="preserve"> D_2 = \</w:t>
-      </w:r>
-      <w:proofErr w:type="gramStart"/>
-      <w:r>
-        <w:t>sqrt{ \left[</w:t>
-      </w:r>
-      <w:proofErr w:type="gramEnd"/>
-      <w:r>
-        <w:t xml:space="preserve"> X - (1-\mu) \cos t \</w:t>
-      </w:r>
-      <w:proofErr w:type="gramStart"/>
-      <w:r>
-        <w:t>right]^</w:t>
-      </w:r>
-      <w:proofErr w:type="gramEnd"/>
-      <w:r>
-        <w:t>2 + \</w:t>
-      </w:r>
-      <w:proofErr w:type="gramStart"/>
-      <w:r>
-        <w:t>left[</w:t>
-      </w:r>
-      <w:proofErr w:type="gramEnd"/>
-      <w:r>
-        <w:t xml:space="preserve"> Y - (1- \mu) \sin t\</w:t>
-      </w:r>
-      <w:proofErr w:type="gramStart"/>
-      <w:r>
-        <w:t>right]^</w:t>
-      </w:r>
-      <w:proofErr w:type="gramEnd"/>
-      <w:r>
-        <w:t>2 + Z^</w:t>
-      </w:r>
-      <w:proofErr w:type="gramStart"/>
-      <w:r>
-        <w:t>2 }</w:t>
-      </w:r>
-      <w:proofErr w:type="gramEnd"/>
-      <w:r>
-        <w:t xml:space="preserve"> \</w:t>
-      </w:r>
-      <w:proofErr w:type="gramStart"/>
-      <w:r>
-        <w:t>; .</w:t>
-      </w:r>
-      <w:proofErr w:type="gramEnd"/>
+        <w:rPr>
+          <w:lang w:val="es-ES"/>
+        </w:rPr>
+        <w:t xml:space="preserve"> </w:t>
+      </w:r>
       <w:r>
         <w:t>\]</w:t>
       </w:r>
     </w:p>
     <w:p>
       <w:r>
-        <w:t xml:space="preserve">This form clearly shows that the underlying equations are explicitly </w:t>
-      </w:r>
-      <w:proofErr w:type="gramStart"/>
-      <w:r>
-        <w:t>time-dependent</w:t>
-      </w:r>
-      <w:proofErr w:type="gramEnd"/>
-      <w:r>
-        <w:t>. Of course, this makes sense since the motion of the restricted particle does not influence the motion of the primary and secondary. Their orbital motion acts like an external force that drives the system but is not part of the system. This is sometimes referred to as the restricted particle reacting to but not ‘back-reacting’ on the other two.</w:t>
-      </w:r>
-    </w:p>
-    <w:p>
-      <w:r>
-        <w:t xml:space="preserve">Despite this non-autonomous character, the CR3BP can be cast into </w:t>
-      </w:r>
-      <w:proofErr w:type="spellStart"/>
-      <w:proofErr w:type="gramStart"/>
-      <w:r>
-        <w:t>a</w:t>
-      </w:r>
-      <w:proofErr w:type="spellEnd"/>
-      <w:proofErr w:type="gramEnd"/>
-      <w:r>
-        <w:t xml:space="preserve"> autonomous form. The key insight is to note that since the massive bodies move in circular motion about their center-of-mass, their angular rate is constant</w:t>
-      </w:r>
-      <w:r>
-        <w:t xml:space="preserve">.  If we construct a co-rotating frame so that it rotates around ${\hat Z}$ and has it’s x-axis aligned with ${\hat X}$ at $t=0$ then </w:t>
-      </w:r>
-      <w:r>
-        <w:t>$x_1 = -\mu$ and $x_2 = (1-\mu)$, with $y_1=y_2=z_1=z_2=0$</w:t>
-      </w:r>
-      <w:r>
-        <w:t xml:space="preserve"> (with the lower case letters indicating the corresponding components of position measured by an observer moving with this frame)</w:t>
-      </w:r>
-      <w:r>
-        <w:t xml:space="preserve">. </w:t>
-      </w:r>
-      <w:r>
-        <w:t xml:space="preserve">and, so, in a co-rotating frame they will appear fixed. </w:t>
-      </w:r>
-      <w:r>
-        <w:t xml:space="preserve">We can relate the position components in the inertial frame with those in this co-rotating frame using </w:t>
-      </w:r>
-    </w:p>
-    <w:p>
-      <w:proofErr w:type="gramStart"/>
-      <w:r>
-        <w:t>\[</w:t>
-      </w:r>
-      <w:proofErr w:type="gramEnd"/>
-      <w:r>
-        <w:t xml:space="preserve"> </w:t>
-      </w:r>
-      <w:proofErr w:type="spellStart"/>
-      <w:r>
-        <w:t>X_i</w:t>
-      </w:r>
-      <w:proofErr w:type="spellEnd"/>
-      <w:r>
-        <w:t xml:space="preserve"> = </w:t>
+        <w:t>When we look at the right-hand sides, we see a similar pattern where the in-</w:t>
+      </w:r>
+      <w:proofErr w:type="gramStart"/>
+      <w:r>
+        <w:t>plane, co-rotating</w:t>
+      </w:r>
+      <w:proofErr w:type="gramEnd"/>
+      <w:r>
+        <w:t xml:space="preserve"> coordinates $</w:t>
       </w:r>
       <w:proofErr w:type="spellStart"/>
       <w:r>
@@ -955,7 +1519,7 @@
       </w:r>
       <w:proofErr w:type="spellEnd"/>
       <w:r>
-        <w:t xml:space="preserve"> \cos(t) – </w:t>
+        <w:t>$ and $</w:t>
       </w:r>
       <w:proofErr w:type="spellStart"/>
       <w:r>
@@ -963,545 +1527,27 @@
       </w:r>
       <w:proofErr w:type="spellEnd"/>
       <w:r>
-        <w:t xml:space="preserve"> \sin(t) \</w:t>
-      </w:r>
-      <w:proofErr w:type="gramStart"/>
-      <w:r>
-        <w:t>; ,</w:t>
-      </w:r>
-      <w:proofErr w:type="gramEnd"/>
-      <w:r>
-        <w:t xml:space="preserve"> \]</w:t>
-      </w:r>
-    </w:p>
-    <w:p>
-      <w:proofErr w:type="gramStart"/>
-      <w:r>
-        <w:t>\[</w:t>
-      </w:r>
-      <w:proofErr w:type="gramEnd"/>
-      <w:r>
-        <w:t xml:space="preserve"> </w:t>
-      </w:r>
-      <w:proofErr w:type="spellStart"/>
-      <w:r>
-        <w:t>Y_i</w:t>
-      </w:r>
-      <w:proofErr w:type="spellEnd"/>
-      <w:r>
-        <w:t xml:space="preserve"> = </w:t>
-      </w:r>
-      <w:proofErr w:type="spellStart"/>
-      <w:r>
-        <w:t>x_i</w:t>
-      </w:r>
-      <w:proofErr w:type="spellEnd"/>
-      <w:r>
-        <w:t xml:space="preserve"> \sin(t) + </w:t>
-      </w:r>
-      <w:proofErr w:type="spellStart"/>
-      <w:r>
-        <w:t>y_i</w:t>
-      </w:r>
-      <w:proofErr w:type="spellEnd"/>
-      <w:r>
-        <w:t xml:space="preserve"> \cos(t) \</w:t>
-      </w:r>
-      <w:proofErr w:type="gramStart"/>
-      <w:r>
-        <w:t>; ,</w:t>
-      </w:r>
-      <w:proofErr w:type="gramEnd"/>
-      <w:r>
-        <w:t xml:space="preserve"> \]</w:t>
-      </w:r>
-    </w:p>
-    <w:p>
-      <w:r>
-        <w:t>and</w:t>
-      </w:r>
-    </w:p>
-    <w:p>
-      <w:proofErr w:type="gramStart"/>
-      <w:r>
-        <w:t>\[</w:t>
-      </w:r>
-      <w:proofErr w:type="gramEnd"/>
-      <w:r>
-        <w:t xml:space="preserve"> </w:t>
-      </w:r>
-      <w:proofErr w:type="spellStart"/>
-      <w:r>
-        <w:t>Z_i</w:t>
-      </w:r>
-      <w:proofErr w:type="spellEnd"/>
-      <w:r>
-        <w:t xml:space="preserve"> = </w:t>
-      </w:r>
-      <w:proofErr w:type="spellStart"/>
-      <w:r>
-        <w:t>z_i</w:t>
-      </w:r>
-      <w:proofErr w:type="spellEnd"/>
-      <w:r>
-        <w:t xml:space="preserve"> \</w:t>
-      </w:r>
-      <w:proofErr w:type="gramStart"/>
-      <w:r>
-        <w:t>; .</w:t>
-      </w:r>
-      <w:proofErr w:type="gramEnd"/>
-      <w:r>
-        <w:t xml:space="preserve"> \]</w:t>
-      </w:r>
-    </w:p>
-    <w:p>
-      <w:r>
-        <w:t>The $</w:t>
-      </w:r>
-      <w:proofErr w:type="spellStart"/>
-      <w:r>
-        <w:t>i</w:t>
-      </w:r>
-      <w:proofErr w:type="spellEnd"/>
-      <w:r>
-        <w:t>$ index</w:t>
-      </w:r>
-      <w:r>
-        <w:t xml:space="preserve"> specifie</w:t>
-      </w:r>
-      <w:r>
-        <w:t xml:space="preserve">s the body in question: </w:t>
-      </w:r>
-      <w:r>
-        <w:t xml:space="preserve">restricted </w:t>
-      </w:r>
-      <w:r>
-        <w:t>$</w:t>
-      </w:r>
-      <w:proofErr w:type="spellStart"/>
-      <w:r>
-        <w:t>i</w:t>
-      </w:r>
-      <w:proofErr w:type="spellEnd"/>
-      <w:r>
-        <w:t xml:space="preserve">$ is </w:t>
-      </w:r>
-      <w:r>
-        <w:t xml:space="preserve">blank, primary </w:t>
-      </w:r>
-      <w:r>
-        <w:t>$</w:t>
-      </w:r>
-      <w:proofErr w:type="spellStart"/>
-      <w:r>
-        <w:t>i</w:t>
-      </w:r>
-      <w:proofErr w:type="spellEnd"/>
-      <w:r>
-        <w:t>=1$</w:t>
-      </w:r>
-      <w:r>
-        <w:t xml:space="preserve">, and secondary </w:t>
-      </w:r>
-      <w:r>
-        <w:t>$</w:t>
-      </w:r>
-      <w:proofErr w:type="spellStart"/>
-      <w:r>
-        <w:t>i</w:t>
-      </w:r>
-      <w:proofErr w:type="spellEnd"/>
-      <w:r>
-        <w:t>=2$</w:t>
-      </w:r>
-      <w:r>
-        <w:t xml:space="preserve">. </w:t>
-      </w:r>
-    </w:p>
-    <w:p>
-      <w:r>
-        <w:t xml:space="preserve">We now need to re-express the inertial equations of motion in the co-rotating frame.  We’ll tackle the terms appearing on the left-hand sides first and then </w:t>
-      </w:r>
-      <w:r>
-        <w:t>right-hand sides second.</w:t>
-      </w:r>
-    </w:p>
-    <w:p>
-      <w:r>
-        <w:lastRenderedPageBreak/>
-        <w:t xml:space="preserve">The time derivatives of the position components </w:t>
-      </w:r>
-      <w:r>
-        <w:t xml:space="preserve">on the left-hand sides </w:t>
-      </w:r>
-      <w:r>
-        <w:t>are a bit</w:t>
-      </w:r>
-      <w:r>
-        <w:t xml:space="preserve"> </w:t>
-      </w:r>
-      <w:r>
-        <w:t xml:space="preserve">involved since the transformation to the co-rotating frame is time dependent. </w:t>
-      </w:r>
-      <w:r>
-        <w:t xml:space="preserve"> Fortunately, o</w:t>
-      </w:r>
-      <w:r>
-        <w:t>nly the in-plane components are involved, with the left-hand sides becoming:</w:t>
-      </w:r>
-    </w:p>
-    <w:p>
-      <w:proofErr w:type="gramStart"/>
-      <w:r>
-        <w:t>\[</w:t>
-      </w:r>
-      <w:proofErr w:type="gramEnd"/>
-      <w:r>
-        <w:t xml:space="preserve"> </w:t>
-      </w:r>
-      <w:proofErr w:type="spellStart"/>
-      <w:r>
-        <w:t>LHS_x</w:t>
-      </w:r>
-      <w:proofErr w:type="spellEnd"/>
-      <w:r>
-        <w:t xml:space="preserve"> = {\</w:t>
-      </w:r>
-      <w:proofErr w:type="spellStart"/>
-      <w:r>
-        <w:t>ddot</w:t>
-      </w:r>
-      <w:proofErr w:type="spellEnd"/>
-      <w:r>
-        <w:t xml:space="preserve"> x} \cos t – 2 {\dot x} \sin t – x \cos t – {\</w:t>
-      </w:r>
-      <w:proofErr w:type="spellStart"/>
-      <w:r>
-        <w:t>ddot</w:t>
-      </w:r>
-      <w:proofErr w:type="spellEnd"/>
-      <w:r>
-        <w:t xml:space="preserve"> y} \sin t – 2 {\dot y} \cos t + y \sin t \; \]</w:t>
-      </w:r>
-    </w:p>
-    <w:p>
-      <w:r>
-        <w:t xml:space="preserve">and </w:t>
-      </w:r>
-    </w:p>
-    <w:p>
-      <w:proofErr w:type="gramStart"/>
-      <w:r>
-        <w:t>\[</w:t>
-      </w:r>
-      <w:proofErr w:type="gramEnd"/>
-      <w:r>
-        <w:t xml:space="preserve"> </w:t>
-      </w:r>
-      <w:proofErr w:type="spellStart"/>
-      <w:r>
-        <w:t>LHS_y</w:t>
-      </w:r>
-      <w:proofErr w:type="spellEnd"/>
-      <w:r>
-        <w:t xml:space="preserve"> = {\</w:t>
-      </w:r>
-      <w:proofErr w:type="spellStart"/>
-      <w:r>
-        <w:t>ddot</w:t>
-      </w:r>
-      <w:proofErr w:type="spellEnd"/>
-      <w:r>
-        <w:t xml:space="preserve"> y} \cos t – 2 {\dot y} \sin t – y \cos t + {\</w:t>
-      </w:r>
-      <w:proofErr w:type="spellStart"/>
-      <w:r>
-        <w:t>ddot</w:t>
-      </w:r>
-      <w:proofErr w:type="spellEnd"/>
-      <w:r>
-        <w:t xml:space="preserve"> x} \sin t – 2 {\dot x} \cos t - x \sin t \</w:t>
-      </w:r>
-      <w:proofErr w:type="gramStart"/>
-      <w:r>
-        <w:t>; .</w:t>
-      </w:r>
-      <w:proofErr w:type="gramEnd"/>
-      <w:r>
-        <w:t>\]</w:t>
-      </w:r>
-    </w:p>
-    <w:p>
-      <w:r>
-        <w:t xml:space="preserve">Note that the terms involving a single time derivative (either </w:t>
-      </w:r>
-      <w:proofErr w:type="gramStart"/>
-      <w:r>
-        <w:t>${\</w:t>
-      </w:r>
-      <w:proofErr w:type="gramEnd"/>
-      <w:r>
-        <w:t xml:space="preserve">dot </w:t>
-      </w:r>
-      <w:proofErr w:type="gramStart"/>
-      <w:r>
-        <w:t>x}$</w:t>
-      </w:r>
-      <w:proofErr w:type="gramEnd"/>
-      <w:r>
-        <w:t xml:space="preserve"> or </w:t>
-      </w:r>
-      <w:proofErr w:type="gramStart"/>
-      <w:r>
-        <w:t>${\</w:t>
-      </w:r>
-      <w:proofErr w:type="gramEnd"/>
-      <w:r>
-        <w:t xml:space="preserve">dot </w:t>
-      </w:r>
-      <w:proofErr w:type="gramStart"/>
-      <w:r>
-        <w:t>y}$</w:t>
-      </w:r>
-      <w:proofErr w:type="gramEnd"/>
-      <w:r>
-        <w:t xml:space="preserve">) appear with opposite signs in the two left-hand sides. This leads to taking linear combinations of the two to isolate the motion for $x$ and $y$, more cleanly: </w:t>
-      </w:r>
-    </w:p>
-    <w:p>
-      <w:proofErr w:type="gramStart"/>
-      <w:r>
-        <w:t>\[</w:t>
-      </w:r>
-      <w:proofErr w:type="gramEnd"/>
-      <w:r>
-        <w:t xml:space="preserve"> </w:t>
-      </w:r>
-      <w:proofErr w:type="spellStart"/>
-      <w:r>
-        <w:t>LHS_x</w:t>
-      </w:r>
-      <w:proofErr w:type="spellEnd"/>
-      <w:r>
-        <w:t xml:space="preserve"> \cos t + </w:t>
-      </w:r>
-      <w:proofErr w:type="spellStart"/>
-      <w:r>
-        <w:t>LHS_y</w:t>
-      </w:r>
-      <w:proofErr w:type="spellEnd"/>
-      <w:r>
-        <w:t xml:space="preserve"> \sin t </w:t>
-      </w:r>
-      <w:proofErr w:type="gramStart"/>
-      <w:r>
-        <w:t>= {\</w:t>
-      </w:r>
-      <w:proofErr w:type="spellStart"/>
-      <w:proofErr w:type="gramEnd"/>
-      <w:r>
-        <w:t>ddot</w:t>
-      </w:r>
-      <w:proofErr w:type="spellEnd"/>
-      <w:r>
-        <w:t xml:space="preserve"> </w:t>
-      </w:r>
-      <w:proofErr w:type="gramStart"/>
-      <w:r>
-        <w:t>x}</w:t>
+        <w:t>$ mix together when converting each of the independent inertial coordinates.</w:t>
+      </w:r>
+      <w:r>
+        <w:t xml:space="preserve">  </w:t>
+      </w:r>
+      <w:r>
+        <w:t xml:space="preserve">We can grind through </w:t>
+      </w:r>
+      <w:r>
+        <w:t>substituting in the transformations above and then combining the right-hand sides in the same way as was done for the left</w:t>
       </w:r>
       <w:r>
         <w:t>-</w:t>
       </w:r>
       <w:r>
-        <w:t>2 {\</w:t>
-      </w:r>
-      <w:proofErr w:type="gramEnd"/>
-      <w:r>
-        <w:t xml:space="preserve">dot </w:t>
-      </w:r>
-      <w:proofErr w:type="gramStart"/>
-      <w:r>
-        <w:t>y}</w:t>
-      </w:r>
-      <w:r>
-        <w:t>-</w:t>
-      </w:r>
-      <w:proofErr w:type="gramEnd"/>
-      <w:r>
-        <w:t>x \; \]</w:t>
-      </w:r>
-    </w:p>
-    <w:p>
-      <w:r>
-        <w:t xml:space="preserve">and </w:t>
-      </w:r>
-    </w:p>
-    <w:p>
-      <w:proofErr w:type="gramStart"/>
-      <w:r>
-        <w:rPr>
-          <w:lang w:val="es-ES"/>
-        </w:rPr>
-        <w:t>\[</w:t>
-      </w:r>
-      <w:proofErr w:type="gramEnd"/>
-      <w:r>
-        <w:rPr>
-          <w:lang w:val="es-ES"/>
-        </w:rPr>
-        <w:t xml:space="preserve"> </w:t>
-      </w:r>
-      <w:r>
-        <w:rPr>
-          <w:lang w:val="es-ES"/>
-        </w:rPr>
-        <w:t>-</w:t>
-      </w:r>
-      <w:proofErr w:type="spellStart"/>
-      <w:r>
-        <w:rPr>
-          <w:lang w:val="es-ES"/>
-        </w:rPr>
-        <w:t>LHS_x</w:t>
-      </w:r>
-      <w:proofErr w:type="spellEnd"/>
-      <w:r>
-        <w:rPr>
-          <w:lang w:val="es-ES"/>
-        </w:rPr>
-        <w:t xml:space="preserve"> \sin t </w:t>
-      </w:r>
-      <w:r>
-        <w:rPr>
-          <w:lang w:val="es-ES"/>
-        </w:rPr>
-        <w:t>+</w:t>
-      </w:r>
-      <w:r>
-        <w:rPr>
-          <w:lang w:val="es-ES"/>
-        </w:rPr>
-        <w:t xml:space="preserve"> LHS_y \cos t = {\</w:t>
-      </w:r>
-      <w:proofErr w:type="spellStart"/>
-      <w:r>
-        <w:rPr>
-          <w:lang w:val="es-ES"/>
-        </w:rPr>
-        <w:t>ddot</w:t>
-      </w:r>
-      <w:proofErr w:type="spellEnd"/>
-      <w:r>
-        <w:rPr>
-          <w:lang w:val="es-ES"/>
-        </w:rPr>
-        <w:t xml:space="preserve"> y} </w:t>
-      </w:r>
-      <w:r>
-        <w:rPr>
-          <w:lang w:val="es-ES"/>
-        </w:rPr>
-        <w:t>+</w:t>
-      </w:r>
-      <w:r>
-        <w:rPr>
-          <w:lang w:val="es-ES"/>
-        </w:rPr>
-        <w:t xml:space="preserve"> 2{\</w:t>
-      </w:r>
-      <w:proofErr w:type="spellStart"/>
-      <w:r>
-        <w:rPr>
-          <w:lang w:val="es-ES"/>
-        </w:rPr>
-        <w:t>dot</w:t>
-      </w:r>
-      <w:proofErr w:type="spellEnd"/>
-      <w:r>
-        <w:rPr>
-          <w:lang w:val="es-ES"/>
-        </w:rPr>
-        <w:t xml:space="preserve"> x} </w:t>
-      </w:r>
-      <w:r>
-        <w:rPr>
-          <w:lang w:val="es-ES"/>
-        </w:rPr>
-        <w:t>-</w:t>
-      </w:r>
-      <w:r>
-        <w:rPr>
-          <w:lang w:val="es-ES"/>
-        </w:rPr>
-        <w:t xml:space="preserve"> y \</w:t>
-      </w:r>
-      <w:proofErr w:type="gramStart"/>
-      <w:r>
-        <w:rPr>
-          <w:lang w:val="es-ES"/>
-        </w:rPr>
-        <w:t>; .</w:t>
-      </w:r>
-      <w:proofErr w:type="gramEnd"/>
-      <w:r>
-        <w:rPr>
-          <w:lang w:val="es-ES"/>
-        </w:rPr>
-        <w:t xml:space="preserve"> </w:t>
-      </w:r>
-      <w:r>
-        <w:t>\]</w:t>
-      </w:r>
-    </w:p>
-    <w:p>
-      <w:r>
-        <w:t>When we look at the right-hand sides, we see a similar pattern where the in-</w:t>
-      </w:r>
-      <w:proofErr w:type="gramStart"/>
-      <w:r>
-        <w:t>plane, co-rotating</w:t>
-      </w:r>
-      <w:proofErr w:type="gramEnd"/>
-      <w:r>
-        <w:t xml:space="preserve"> coordinates $</w:t>
-      </w:r>
-      <w:proofErr w:type="spellStart"/>
-      <w:r>
-        <w:t>x_i</w:t>
-      </w:r>
-      <w:proofErr w:type="spellEnd"/>
-      <w:r>
-        <w:t>$ and $</w:t>
-      </w:r>
-      <w:proofErr w:type="spellStart"/>
-      <w:r>
-        <w:t>y_i</w:t>
-      </w:r>
-      <w:proofErr w:type="spellEnd"/>
-      <w:r>
-        <w:t>$ mix together when converting each of the independent inertial coordinates.</w:t>
-      </w:r>
-      <w:r>
-        <w:t xml:space="preserve">  </w:t>
-      </w:r>
-      <w:r>
-        <w:t xml:space="preserve">We can grind through </w:t>
-      </w:r>
-      <w:r>
-        <w:t>substituting in the transformations above and then combining the right-hand sides in the same way as was done for the left</w:t>
-      </w:r>
-      <w:r>
-        <w:t>-</w:t>
-      </w:r>
-      <w:r>
         <w:t>hand sides above</w:t>
       </w:r>
       <w:r>
         <w:t xml:space="preserve"> (</w:t>
       </w:r>
-      <w:hyperlink r:id="rId10" w:history="1">
+      <w:hyperlink r:id="rId11" w:history="1">
         <w:r>
           <w:rPr>
             <w:rStyle w:val="Hyperlink"/>
@@ -1693,6 +1739,7 @@
     </w:p>
     <w:p>
       <w:r>
+        <w:lastRenderedPageBreak/>
         <w:t>and</w:t>
       </w:r>
     </w:p>
@@ -1817,7 +1864,6 @@
     <w:p>
       <w:proofErr w:type="gramStart"/>
       <w:r>
-        <w:lastRenderedPageBreak/>
         <w:t>\[</w:t>
       </w:r>
       <w:proofErr w:type="gramEnd"/>

</xml_diff>